<commit_message>
Additions / Modifications AFTER the SECOND day
</commit_message>
<xml_diff>
--- a/Links to chats.docx
+++ b/Links to chats.docx
@@ -3,8 +3,200 @@
 <w:document xmlns:wpc="http://schemas.microsoft.com/office/word/2010/wordprocessingCanvas" xmlns:cx="http://schemas.microsoft.com/office/drawing/2014/chartex" xmlns:cx1="http://schemas.microsoft.com/office/drawing/2015/9/8/chartex" xmlns:cx2="http://schemas.microsoft.com/office/drawing/2015/10/21/chartex" xmlns:cx3="http://schemas.microsoft.com/office/drawing/2016/5/9/chartex" xmlns:cx4="http://schemas.microsoft.com/office/drawing/2016/5/10/chartex" xmlns:cx5="http://schemas.microsoft.com/office/drawing/2016/5/11/chartex" xmlns:cx6="http://schemas.microsoft.com/office/drawing/2016/5/12/chartex" xmlns:cx7="http://schemas.microsoft.com/office/drawing/2016/5/13/chartex" xmlns:cx8="http://schemas.microsoft.com/office/drawing/2016/5/14/chartex" xmlns:mc="http://schemas.openxmlformats.org/markup-compatibility/2006" xmlns:aink="http://schemas.microsoft.com/office/drawing/2016/ink" xmlns:am3d="http://schemas.microsoft.com/office/drawing/2017/model3d" xmlns:o="urn:schemas-microsoft-com:office:office" xmlns:oel="http://schemas.microsoft.com/office/2019/extlst" xmlns:r="http://schemas.openxmlformats.org/officeDocument/2006/relationships" xmlns:m="http://schemas.openxmlformats.org/officeDocument/2006/math" xmlns:v="urn:schemas-microsoft-com:vml" xmlns:wp14="http://schemas.microsoft.com/office/word/2010/wordprocessingDrawing" xmlns:wp="http://schemas.openxmlformats.org/drawingml/2006/wordprocessingDrawing" xmlns:w10="urn:schemas-microsoft-com:office:word" xmlns:w="http://schemas.openxmlformats.org/wordprocessingml/2006/main" xmlns:w14="http://schemas.microsoft.com/office/word/2010/wordml" xmlns:w15="http://schemas.microsoft.com/office/word/2012/wordml" xmlns:w16cex="http://schemas.microsoft.com/office/word/2018/wordml/cex" xmlns:w16cid="http://schemas.microsoft.com/office/word/2016/wordml/cid" xmlns:w16="http://schemas.microsoft.com/office/word/2018/wordml" xmlns:w16du="http://schemas.microsoft.com/office/word/2023/wordml/word16du" xmlns:w16sdtdh="http://schemas.microsoft.com/office/word/2020/wordml/sdtdatahash" xmlns:w16sdtfl="http://schemas.microsoft.com/office/word/2024/wordml/sdtformatlock" xmlns:w16se="http://schemas.microsoft.com/office/word/2015/wordml/symex" xmlns:wpg="http://schemas.microsoft.com/office/word/2010/wordprocessingGroup" xmlns:wpi="http://schemas.microsoft.com/office/word/2010/wordprocessingInk" xmlns:wne="http://schemas.microsoft.com/office/word/2006/wordml" xmlns:wps="http://schemas.microsoft.com/office/word/2010/wordprocessingShape" mc:Ignorable="w14 w15 w16se w16cid w16 w16cex w16sdtdh w16sdtfl w16du wp14">
   <w:body>
     <w:p>
+      <w:pPr>
+        <w:rPr>
+          <w:b/>
+          <w:bCs/>
+          <w:sz w:val="28"/>
+          <w:szCs w:val="28"/>
+        </w:rPr>
+      </w:pPr>
       <w:r>
+        <w:rPr>
+          <w:b/>
+          <w:bCs/>
+          <w:sz w:val="28"/>
+          <w:szCs w:val="28"/>
+        </w:rPr>
         <w:t>Links to chats</w:t>
+      </w:r>
+    </w:p>
+    <w:p/>
+    <w:p>
+      <w:pPr>
+        <w:rPr>
+          <w:b/>
+          <w:bCs/>
+          <w:i/>
+          <w:iCs/>
+        </w:rPr>
+      </w:pPr>
+      <w:r>
+        <w:rPr>
+          <w:b/>
+          <w:bCs/>
+          <w:i/>
+          <w:iCs/>
+        </w:rPr>
+        <w:t>28.09.2026</w:t>
+      </w:r>
+    </w:p>
+    <w:p>
+      <w:pPr>
+        <w:rPr>
+          <w:u w:val="single"/>
+        </w:rPr>
+      </w:pPr>
+      <w:r>
+        <w:rPr>
+          <w:u w:val="single"/>
+        </w:rPr>
+        <w:t>ChatGPT</w:t>
+      </w:r>
+    </w:p>
+    <w:p>
+      <w:hyperlink r:id="rId4" w:history="1">
+        <w:r>
+          <w:rPr>
+            <w:rStyle w:val="Hyperlink"/>
+          </w:rPr>
+          <w:t>https://chatgpt.com/share/6abfecc8-e8d0-83eb-81a2-cc479e911aa5</w:t>
+        </w:r>
+      </w:hyperlink>
+    </w:p>
+    <w:p>
+      <w:hyperlink r:id="rId5" w:history="1">
+        <w:r>
+          <w:rPr>
+            <w:rStyle w:val="Hyperlink"/>
+          </w:rPr>
+          <w:t>https://chatgpt.com/share/6abfed0b-a284-83eb-a5fd-3963b1b122a7</w:t>
+        </w:r>
+      </w:hyperlink>
+    </w:p>
+    <w:p>
+      <w:hyperlink r:id="rId6" w:history="1">
+        <w:r>
+          <w:rPr>
+            <w:rStyle w:val="Hyperlink"/>
+          </w:rPr>
+          <w:t>https://chatgpt.com/share/6abfed26-6f58-83eb-9a8e-d6f3342612f7</w:t>
+        </w:r>
+      </w:hyperlink>
+    </w:p>
+    <w:p>
+      <w:hyperlink r:id="rId7" w:history="1">
+        <w:r>
+          <w:rPr>
+            <w:rStyle w:val="Hyperlink"/>
+          </w:rPr>
+          <w:t>https://chatgpt.com/share/6abfed47-52b8-83ed-87ac-c1cba3e35794</w:t>
+        </w:r>
+      </w:hyperlink>
+    </w:p>
+    <w:p/>
+    <w:p>
+      <w:pPr>
+        <w:rPr>
+          <w:b/>
+          <w:bCs/>
+          <w:i/>
+          <w:iCs/>
+        </w:rPr>
+      </w:pPr>
+      <w:r>
+        <w:rPr>
+          <w:b/>
+          <w:bCs/>
+          <w:i/>
+          <w:iCs/>
+        </w:rPr>
+        <w:t>02.10.2026</w:t>
+      </w:r>
+    </w:p>
+    <w:p>
+      <w:pPr>
+        <w:rPr>
+          <w:u w:val="single"/>
+        </w:rPr>
+      </w:pPr>
+      <w:r>
+        <w:rPr>
+          <w:u w:val="single"/>
+        </w:rPr>
+        <w:t>ChatGPT</w:t>
+      </w:r>
+    </w:p>
+    <w:p>
+      <w:hyperlink r:id="rId8" w:history="1">
+        <w:r>
+          <w:rPr>
+            <w:rStyle w:val="Hyperlink"/>
+          </w:rPr>
+          <w:t>https://chatgpt.com/share/6abfeb26-5170-83ed-b08c-df4a19bfdb38</w:t>
+        </w:r>
+      </w:hyperlink>
+    </w:p>
+    <w:p>
+      <w:hyperlink r:id="rId9" w:history="1">
+        <w:r>
+          <w:rPr>
+            <w:rStyle w:val="Hyperlink"/>
+          </w:rPr>
+          <w:t>https://chatgpt.com/share/6abfeb3d-cea4-83eb-80d2-e7c378cb6211</w:t>
+        </w:r>
+      </w:hyperlink>
+    </w:p>
+    <w:p>
+      <w:r>
+        <w:t>https://chatgpt.com/share/6abfeb56-556c-83ed-8e80-34300e627dcc</w:t>
+      </w:r>
+    </w:p>
+    <w:p>
+      <w:pPr>
+        <w:rPr>
+          <w:u w:val="single"/>
+        </w:rPr>
+      </w:pPr>
+      <w:r>
+        <w:rPr>
+          <w:u w:val="single"/>
+        </w:rPr>
+        <w:t>Claude ai</w:t>
+      </w:r>
+    </w:p>
+    <w:p>
+      <w:r>
+        <w:t>https://claude.ai/share/d6ad5964-378b-4321-bdf9-193310b51ef0</w:t>
+      </w:r>
+    </w:p>
+    <w:p>
+      <w:pPr>
+        <w:rPr>
+          <w:i/>
+          <w:iCs/>
+        </w:rPr>
+      </w:pPr>
+      <w:proofErr w:type="spellStart"/>
+      <w:r>
+        <w:rPr>
+          <w:i/>
+          <w:iCs/>
+        </w:rPr>
+        <w:t>Synthesia</w:t>
+      </w:r>
+      <w:proofErr w:type="spellEnd"/>
+      <w:r>
+        <w:rPr>
+          <w:i/>
+          <w:iCs/>
+        </w:rPr>
+        <w:t xml:space="preserve"> video</w:t>
+      </w:r>
+    </w:p>
+    <w:p>
+      <w:r>
+        <w:t>https://share.synthesia.io/6e5010a8-e0b2-4462-b264-460f65dc19df</w:t>
       </w:r>
     </w:p>
     <w:sectPr>
@@ -416,6 +608,7 @@
   <w:style w:type="paragraph" w:default="1" w:styleId="Normal">
     <w:name w:val="Normal"/>
     <w:qFormat/>
+    <w:rsid w:val="005935F1"/>
   </w:style>
   <w:style w:type="paragraph" w:styleId="Heading1">
     <w:name w:val="heading 1"/>
@@ -931,6 +1124,29 @@
       <w:smallCaps/>
       <w:color w:val="2F5496" w:themeColor="accent1" w:themeShade="BF"/>
       <w:spacing w:val="5"/>
+    </w:rPr>
+  </w:style>
+  <w:style w:type="character" w:styleId="Hyperlink">
+    <w:name w:val="Hyperlink"/>
+    <w:basedOn w:val="DefaultParagraphFont"/>
+    <w:uiPriority w:val="99"/>
+    <w:unhideWhenUsed/>
+    <w:rsid w:val="00397307"/>
+    <w:rPr>
+      <w:color w:val="0563C1" w:themeColor="hyperlink"/>
+      <w:u w:val="single"/>
+    </w:rPr>
+  </w:style>
+  <w:style w:type="character" w:styleId="UnresolvedMention">
+    <w:name w:val="Unresolved Mention"/>
+    <w:basedOn w:val="DefaultParagraphFont"/>
+    <w:uiPriority w:val="99"/>
+    <w:semiHidden/>
+    <w:unhideWhenUsed/>
+    <w:rsid w:val="00397307"/>
+    <w:rPr>
+      <w:color w:val="605E5C"/>
+      <w:shd w:val="clear" w:color="auto" w:fill="E1DFDD"/>
     </w:rPr>
   </w:style>
 </w:styles>

</xml_diff>